<commit_message>
Borrowing limit is a multi-member provision only: s. 5.4(b) deleted from the two single-member manager-managed forms and the rest relettered; a sole owner is no longer asked for a number
Co-Authored-By: Claude Fable 5.1 <noreply@anthropic.com>
</commit_message>
<xml_diff>
--- a/docs/word/SMMMDE - FPSLLC Operating Agreement - Manager-Managed Single Member (Disregarded) - DRAFT.docx
+++ b/docs/word/SMMMDE - FPSLLC Operating Agreement - Manager-Managed Single Member (Disregarded) - DRAFT.docx
@@ -1676,37 +1676,22 @@
           <w:sz w:val="24"/>
           <w:szCs w:val="24"/>
         </w:rPr>
-        <w:t xml:space="preserve">(a) sell, exchange, or otherwise dispose of all or substantially all of the Associated Assets of the Company or of any Protected Series, other than in the ordinary course of business;</w:t>
-      </w:r>
-    </w:p>
-    <w:p>
-      <w:pPr>
-        <w:widowControl/>
-        <w:spacing w:after="160"/>
-        <w:jc w:val="both"/>
-      </w:pPr>
-      <w:r>
-        <w:rPr>
-          <w:rFonts w:ascii="Times New Roman" w:hAnsi="Times New Roman"/>
-          <w:sz w:val="24"/>
-          <w:szCs w:val="24"/>
-        </w:rPr>
-        <w:t xml:space="preserve">(b) incur, on behalf of the Company or any Protected Series, indebtedness in excess of $[THRESHOLD] in a single transaction or series of related transactions, or guarantee the obligation of any person (and no guarantee of the obligations of one Protected Series by another or by the Company shall be made except by an express written instrument approved under this Section); or</w:t>
-      </w:r>
-    </w:p>
-    <w:p>
-      <w:pPr>
-        <w:widowControl/>
-        <w:spacing w:after="160"/>
-        <w:jc w:val="both"/>
-      </w:pPr>
-      <w:r>
-        <w:rPr>
-          <w:rFonts w:ascii="Times New Roman" w:hAnsi="Times New Roman"/>
-          <w:sz w:val="24"/>
-          <w:szCs w:val="24"/>
-        </w:rPr>
-        <w:t xml:space="preserve">(c) file, amend, or cancel a statement of authority under s. 605.0302, Florida Statutes, or record a certified copy of one.</w:t>
+        <w:t xml:space="preserve">(a) sell, exchange, or otherwise dispose of all or substantially all of the Associated Assets of the Company or of any Protected Series, other than in the ordinary course of business; or</w:t>
+      </w:r>
+    </w:p>
+    <w:p>
+      <w:pPr>
+        <w:widowControl/>
+        <w:spacing w:after="160"/>
+        <w:jc w:val="both"/>
+      </w:pPr>
+      <w:r>
+        <w:rPr>
+          <w:rFonts w:ascii="Times New Roman" w:hAnsi="Times New Roman"/>
+          <w:sz w:val="24"/>
+          <w:szCs w:val="24"/>
+        </w:rPr>
+        <w:t xml:space="preserve">(b) file, amend, or cancel a statement of authority under s. 605.0302, Florida Statutes, or record a certified copy of one.</w:t>
       </w:r>
     </w:p>
     <w:p>
@@ -1819,7 +1804,7 @@
           <w:sz w:val="24"/>
           <w:szCs w:val="24"/>
         </w:rPr>
-        <w:t xml:space="preserve"> With the consent of the Member required by Section 5.4(c), the Manager may cause the Company to file with the Department a statement of authority under s. 605.0302, Florida Statutes, stating the authority, or the limitations on the authority, of the Manager, of any Protected Series Manager, or of any person holding a specified position, to transfer or encumber real property held in the name of the Company or of a Protected Series, and may cause a certified copy of that statement to be recorded in the official records of any county in which the real property is located. A statement so filed shall be consistent with this Agreement, and shall be amended or cancelled as necessary to keep it accurate. The limitations in Section 5.4 apply to the Manager whether or not a statement of authority is filed or recorded.</w:t>
+        <w:t xml:space="preserve"> With the consent of the Member required by Section 5.4(b), the Manager may cause the Company to file with the Department a statement of authority under s. 605.0302, Florida Statutes, stating the authority, or the limitations on the authority, of the Manager, of any Protected Series Manager, or of any person holding a specified position, to transfer or encumber real property held in the name of the Company or of a Protected Series, and may cause a certified copy of that statement to be recorded in the official records of any county in which the real property is located. A statement so filed shall be consistent with this Agreement, and shall be amended or cancelled as necessary to keep it accurate. The limitations in Section 5.4 apply to the Manager whether or not a statement of authority is filed or recorded.</w:t>
       </w:r>
     </w:p>
     <w:p>

</xml_diff>